<commit_message>
change terms of reference
</commit_message>
<xml_diff>
--- a/Terms of reference.docx
+++ b/Terms of reference.docx
@@ -295,27 +295,7 @@
           <w:sz w:val="28"/>
           <w:szCs w:val="28"/>
         </w:rPr>
-        <w:t xml:space="preserve">В ході розроблення сайту (доданку) будуть </w:t>
-      </w:r>
-      <w:r>
-        <w:rPr>
-          <w:rFonts w:ascii="Times New Roman" w:eastAsia="Times New Roman" w:hAnsi="Times New Roman" w:cs="Times New Roman"/>
-          <w:b/>
-          <w:color w:val="000000"/>
-          <w:sz w:val="28"/>
-          <w:szCs w:val="28"/>
-        </w:rPr>
-        <w:t xml:space="preserve">використовуватися </w:t>
-      </w:r>
-      <w:r>
-        <w:rPr>
-          <w:rFonts w:ascii="Times New Roman" w:eastAsia="Times New Roman" w:hAnsi="Times New Roman" w:cs="Times New Roman"/>
-          <w:b/>
-          <w:color w:val="000000"/>
-          <w:sz w:val="28"/>
-          <w:szCs w:val="28"/>
-        </w:rPr>
-        <w:t>наступні технології:</w:t>
+        <w:t>В ході розроблення сайту (доданку) будуть використовуватися наступні технології:</w:t>
       </w:r>
     </w:p>
     <w:p>
@@ -503,7 +483,59 @@
           <w:szCs w:val="28"/>
           <w:lang w:val="en-US"/>
         </w:rPr>
-        <w:t>Json-server</w:t>
+        <w:t>Json</w:t>
+      </w:r>
+      <w:r>
+        <w:rPr>
+          <w:rFonts w:ascii="Times New Roman" w:eastAsia="Times New Roman" w:hAnsi="Times New Roman" w:cs="Times New Roman"/>
+          <w:color w:val="000000"/>
+          <w:sz w:val="28"/>
+          <w:szCs w:val="28"/>
+          <w:lang w:val="ru-RU"/>
+        </w:rPr>
+        <w:t>-</w:t>
+      </w:r>
+      <w:r>
+        <w:rPr>
+          <w:rFonts w:ascii="Times New Roman" w:eastAsia="Times New Roman" w:hAnsi="Times New Roman" w:cs="Times New Roman"/>
+          <w:color w:val="000000"/>
+          <w:sz w:val="28"/>
+          <w:szCs w:val="28"/>
+          <w:lang w:val="en-US"/>
+        </w:rPr>
+        <w:t>server</w:t>
+      </w:r>
+    </w:p>
+    <w:p>
+      <w:pPr>
+        <w:pBdr>
+          <w:top w:val="nil"/>
+          <w:left w:val="nil"/>
+          <w:bottom w:val="nil"/>
+          <w:right w:val="nil"/>
+          <w:between w:val="nil"/>
+        </w:pBdr>
+        <w:shd w:val="clear" w:color="auto" w:fill="FFFFFF"/>
+        <w:spacing w:after="0" w:line="360" w:lineRule="auto"/>
+        <w:ind w:left="1276"/>
+        <w:jc w:val="both"/>
+        <w:rPr>
+          <w:rFonts w:ascii="Times New Roman" w:eastAsia="Times New Roman" w:hAnsi="Times New Roman" w:cs="Times New Roman"/>
+          <w:color w:val="000000"/>
+          <w:sz w:val="28"/>
+          <w:szCs w:val="28"/>
+          <w:lang w:val="ru-RU"/>
+        </w:rPr>
+      </w:pPr>
+      <w:r>
+        <w:rPr>
+          <w:rFonts w:ascii="Times New Roman" w:eastAsia="Times New Roman" w:hAnsi="Times New Roman" w:cs="Times New Roman"/>
+          <w:color w:val="000000"/>
+          <w:sz w:val="28"/>
+          <w:szCs w:val="28"/>
+          <w:lang w:val="en-US"/>
+        </w:rPr>
+        <w:t>Vue.js</w:t>
       </w:r>
     </w:p>
     <w:p>
@@ -637,6 +669,7 @@
           <w:sz w:val="28"/>
           <w:szCs w:val="28"/>
         </w:rPr>
+        <w:lastRenderedPageBreak/>
         <w:t xml:space="preserve">Плановий термін захисту роботи:  </w:t>
       </w:r>
       <w:r>
@@ -694,7 +727,6 @@
           <w:sz w:val="28"/>
           <w:szCs w:val="28"/>
         </w:rPr>
-        <w:lastRenderedPageBreak/>
         <w:t>Виконавець студент групи МІТ-21           __________</w:t>
       </w:r>
       <w:r>

</xml_diff>